<commit_message>
Add homework 2 Part 3
</commit_message>
<xml_diff>
--- a/Homework_2_db_normalization/Homework 2.docx
+++ b/Homework_2_db_normalization/Homework 2.docx
@@ -444,7 +444,6 @@
           <w:lang w:val="en-US"/>
         </w:rPr>
       </w:pPr>
-      <w:proofErr w:type="spellStart"/>
       <w:r>
         <w:rPr>
           <w:rFonts w:ascii="Times New Roman" w:hAnsi="Times New Roman" w:cs="Times New Roman"/>
@@ -454,7 +453,6 @@
         </w:rPr>
         <w:t>VenueId</w:t>
       </w:r>
-      <w:proofErr w:type="spellEnd"/>
       <w:r>
         <w:rPr>
           <w:rFonts w:ascii="Times New Roman" w:hAnsi="Times New Roman" w:cs="Times New Roman"/>
@@ -685,7 +683,23 @@
           <w:sz w:val="28"/>
           <w:lang w:val="en-US"/>
         </w:rPr>
-        <w:t xml:space="preserve"> INT, NOT NULL</w:t>
+        <w:t xml:space="preserve"> </w:t>
+      </w:r>
+      <w:r>
+        <w:rPr>
+          <w:rFonts w:ascii="Times New Roman" w:hAnsi="Times New Roman" w:cs="Times New Roman"/>
+          <w:sz w:val="28"/>
+          <w:lang w:val="en-US"/>
+        </w:rPr>
+        <w:t>INTEGER</w:t>
+      </w:r>
+      <w:r>
+        <w:rPr>
+          <w:rFonts w:ascii="Times New Roman" w:hAnsi="Times New Roman" w:cs="Times New Roman"/>
+          <w:sz w:val="28"/>
+          <w:lang w:val="en-US"/>
+        </w:rPr>
+        <w:t>, NOT NULL</w:t>
       </w:r>
     </w:p>
     <w:p>
@@ -1105,7 +1119,6 @@
           <w:lang w:val="en-US"/>
         </w:rPr>
       </w:pPr>
-      <w:proofErr w:type="spellStart"/>
       <w:r>
         <w:rPr>
           <w:rStyle w:val="HTML"/>
@@ -1117,7 +1130,6 @@
         <w:lastRenderedPageBreak/>
         <w:t>Title</w:t>
       </w:r>
-      <w:proofErr w:type="spellEnd"/>
       <w:r>
         <w:rPr>
           <w:rFonts w:ascii="Times New Roman" w:hAnsi="Times New Roman" w:cs="Times New Roman"/>
@@ -1270,7 +1282,6 @@
         </w:rPr>
         <w:t>End</w:t>
       </w:r>
-      <w:proofErr w:type="spellStart"/>
       <w:r>
         <w:rPr>
           <w:rStyle w:val="HTML"/>
@@ -1281,7 +1292,6 @@
         </w:rPr>
         <w:t>Time</w:t>
       </w:r>
-      <w:proofErr w:type="spellEnd"/>
       <w:r>
         <w:rPr>
           <w:rFonts w:ascii="Times New Roman" w:hAnsi="Times New Roman" w:cs="Times New Roman"/>
@@ -1339,7 +1349,6 @@
           <w:lang w:val="en-US"/>
         </w:rPr>
       </w:pPr>
-      <w:proofErr w:type="spellStart"/>
       <w:r>
         <w:rPr>
           <w:rStyle w:val="HTML"/>
@@ -1350,7 +1359,6 @@
         </w:rPr>
         <w:t>PK_Events</w:t>
       </w:r>
-      <w:proofErr w:type="spellEnd"/>
       <w:r>
         <w:rPr>
           <w:rFonts w:ascii="Times New Roman" w:hAnsi="Times New Roman" w:cs="Times New Roman"/>
@@ -3021,7 +3029,17 @@
           <w:sz w:val="28"/>
           <w:lang w:val="en-US"/>
         </w:rPr>
-        <w:t>) REFERENCES Events(</w:t>
+        <w:t xml:space="preserve">) </w:t>
+      </w:r>
+      <w:bookmarkStart w:id="0" w:name="_GoBack"/>
+      <w:bookmarkEnd w:id="0"/>
+      <w:r>
+        <w:rPr>
+          <w:rFonts w:ascii="Times New Roman" w:eastAsia="Calibri" w:hAnsi="Times New Roman" w:cs="Times New Roman"/>
+          <w:sz w:val="28"/>
+          <w:lang w:val="en-US"/>
+        </w:rPr>
+        <w:t>REFERENCES Events(</w:t>
       </w:r>
       <w:proofErr w:type="spellStart"/>
       <w:r>
@@ -3291,23 +3309,13 @@
           <w:sz w:val="28"/>
         </w:rPr>
       </w:pPr>
-      <w:proofErr w:type="spellStart"/>
       <w:r>
         <w:rPr>
           <w:rFonts w:ascii="Times New Roman" w:eastAsia="Calibri" w:hAnsi="Times New Roman" w:cs="Times New Roman"/>
           <w:b/>
           <w:sz w:val="28"/>
         </w:rPr>
-        <w:t>Venues</w:t>
-      </w:r>
-      <w:proofErr w:type="spellEnd"/>
-      <w:r>
-        <w:rPr>
-          <w:rFonts w:ascii="Times New Roman" w:eastAsia="Calibri" w:hAnsi="Times New Roman" w:cs="Times New Roman"/>
-          <w:b/>
-          <w:sz w:val="28"/>
-        </w:rPr>
-        <w:t xml:space="preserve"> и </w:t>
+        <w:t xml:space="preserve">Venues и </w:t>
       </w:r>
       <w:proofErr w:type="spellStart"/>
       <w:r>
@@ -3640,13 +3648,147 @@
     </w:p>
     <w:p>
       <w:pPr>
+        <w:spacing w:after="60" w:line="240" w:lineRule="auto"/>
+        <w:jc w:val="both"/>
+        <w:rPr>
+          <w:rFonts w:ascii="Times New Roman" w:hAnsi="Times New Roman" w:cs="Times New Roman"/>
+          <w:sz w:val="28"/>
+        </w:rPr>
+      </w:pPr>
+    </w:p>
+    <w:p>
+      <w:pPr>
+        <w:spacing w:after="0" w:line="240" w:lineRule="auto"/>
+        <w:jc w:val="both"/>
         <w:rPr>
           <w:rFonts w:ascii="Times New Roman" w:hAnsi="Times New Roman" w:cs="Times New Roman"/>
           <w:sz w:val="32"/>
         </w:rPr>
       </w:pPr>
-      <w:bookmarkStart w:id="0" w:name="_GoBack"/>
-      <w:bookmarkEnd w:id="0"/>
+      <w:r>
+        <w:rPr>
+          <w:rFonts w:ascii="Times New Roman" w:hAnsi="Times New Roman" w:cs="Times New Roman"/>
+          <w:sz w:val="32"/>
+          <w:lang w:val="en-US"/>
+        </w:rPr>
+        <w:t>Part 3: ER-</w:t>
+      </w:r>
+      <w:r>
+        <w:rPr>
+          <w:rFonts w:ascii="Times New Roman" w:hAnsi="Times New Roman" w:cs="Times New Roman"/>
+          <w:sz w:val="32"/>
+        </w:rPr>
+        <w:t>диаграмма:</w:t>
+      </w:r>
+    </w:p>
+    <w:p>
+      <w:pPr>
+        <w:spacing w:after="0" w:line="240" w:lineRule="auto"/>
+        <w:ind w:left="284"/>
+        <w:jc w:val="both"/>
+        <w:rPr>
+          <w:rFonts w:ascii="Times New Roman" w:hAnsi="Times New Roman" w:cs="Times New Roman"/>
+          <w:sz w:val="32"/>
+        </w:rPr>
+      </w:pPr>
+    </w:p>
+    <w:p>
+      <w:pPr>
+        <w:spacing w:after="0" w:line="240" w:lineRule="auto"/>
+        <w:jc w:val="center"/>
+        <w:rPr>
+          <w:rFonts w:ascii="Times New Roman" w:hAnsi="Times New Roman" w:cs="Times New Roman"/>
+          <w:sz w:val="28"/>
+        </w:rPr>
+      </w:pPr>
+      <w:r>
+        <w:rPr>
+          <w:noProof/>
+          <w:lang w:eastAsia="ru-RU"/>
+        </w:rPr>
+        <w:drawing>
+          <wp:inline distT="0" distB="0" distL="0" distR="0" wp14:anchorId="6F7C2153" wp14:editId="08176677">
+            <wp:extent cx="4258733" cy="3087947"/>
+            <wp:effectExtent l="0" t="0" r="8890" b="0"/>
+            <wp:docPr id="3" name="Рисунок 3"/>
+            <wp:cNvGraphicFramePr>
+              <a:graphicFrameLocks xmlns:a="http://schemas.openxmlformats.org/drawingml/2006/main" noChangeAspect="1"/>
+            </wp:cNvGraphicFramePr>
+            <a:graphic xmlns:a="http://schemas.openxmlformats.org/drawingml/2006/main">
+              <a:graphicData uri="http://schemas.openxmlformats.org/drawingml/2006/picture">
+                <pic:pic xmlns:pic="http://schemas.openxmlformats.org/drawingml/2006/picture">
+                  <pic:nvPicPr>
+                    <pic:cNvPr id="3" name="ER_Diagram_Tickets.png"/>
+                    <pic:cNvPicPr/>
+                  </pic:nvPicPr>
+                  <pic:blipFill>
+                    <a:blip r:embed="rId5">
+                      <a:extLst>
+                        <a:ext uri="{28A0092B-C50C-407E-A947-70E740481C1C}">
+                          <a14:useLocalDpi xmlns:a14="http://schemas.microsoft.com/office/drawing/2010/main" val="0"/>
+                        </a:ext>
+                      </a:extLst>
+                    </a:blip>
+                    <a:stretch>
+                      <a:fillRect/>
+                    </a:stretch>
+                  </pic:blipFill>
+                  <pic:spPr>
+                    <a:xfrm>
+                      <a:off x="0" y="0"/>
+                      <a:ext cx="4362969" cy="3163527"/>
+                    </a:xfrm>
+                    <a:prstGeom prst="rect">
+                      <a:avLst/>
+                    </a:prstGeom>
+                  </pic:spPr>
+                </pic:pic>
+              </a:graphicData>
+            </a:graphic>
+          </wp:inline>
+        </w:drawing>
+      </w:r>
+    </w:p>
+    <w:p>
+      <w:pPr>
+        <w:spacing w:after="0" w:line="240" w:lineRule="auto"/>
+        <w:rPr>
+          <w:rFonts w:ascii="Times New Roman" w:hAnsi="Times New Roman" w:cs="Times New Roman"/>
+          <w:sz w:val="28"/>
+        </w:rPr>
+      </w:pPr>
+    </w:p>
+    <w:p>
+      <w:pPr>
+        <w:spacing w:after="0" w:line="240" w:lineRule="auto"/>
+        <w:jc w:val="center"/>
+        <w:rPr>
+          <w:rFonts w:ascii="Times New Roman" w:hAnsi="Times New Roman" w:cs="Times New Roman"/>
+          <w:sz w:val="28"/>
+        </w:rPr>
+      </w:pPr>
+      <w:r>
+        <w:rPr>
+          <w:rFonts w:ascii="Times New Roman" w:hAnsi="Times New Roman" w:cs="Times New Roman"/>
+          <w:sz w:val="28"/>
+        </w:rPr>
+        <w:t xml:space="preserve">Рисунок 1 – </w:t>
+      </w:r>
+      <w:r>
+        <w:rPr>
+          <w:rFonts w:ascii="Times New Roman" w:hAnsi="Times New Roman" w:cs="Times New Roman"/>
+          <w:sz w:val="28"/>
+          <w:lang w:val="en-US"/>
+        </w:rPr>
+        <w:t>ER</w:t>
+      </w:r>
+      <w:r>
+        <w:rPr>
+          <w:rFonts w:ascii="Times New Roman" w:hAnsi="Times New Roman" w:cs="Times New Roman"/>
+          <w:sz w:val="28"/>
+        </w:rPr>
+        <w:t>-диаграмма спроектированной базы данных</w:t>
+      </w:r>
     </w:p>
     <w:sectPr>
       <w:pgSz w:w="11906" w:h="16838"/>

</xml_diff>